<commit_message>
report and slides fix grammer, update gantt chart and few revisions
</commit_message>
<xml_diff>
--- a/Documentation/Weekly Report/week13/CMSC-4920-Week13Report-Group2.docx
+++ b/Documentation/Weekly Report/week13/CMSC-4920-Week13Report-Group2.docx
@@ -1535,27 +1535,13 @@
         <w:rPr>
           <w:rFonts w:ascii="Times New Roman" w:hAnsi="Times New Roman" w:cs="Times New Roman"/>
         </w:rPr>
-        <w:t xml:space="preserve">, and </w:t>
-      </w:r>
-      <w:proofErr w:type="gramStart"/>
-      <w:r>
-        <w:rPr>
-          <w:rFonts w:ascii="Times New Roman" w:hAnsi="Times New Roman" w:cs="Times New Roman"/>
-        </w:rPr>
-        <w:t xml:space="preserve">to </w:t>
-      </w:r>
-      <w:r>
-        <w:rPr>
-          <w:rFonts w:ascii="Times New Roman" w:hAnsi="Times New Roman" w:cs="Times New Roman"/>
-        </w:rPr>
-        <w:t>finish</w:t>
-      </w:r>
-      <w:proofErr w:type="gramEnd"/>
-      <w:r>
-        <w:rPr>
-          <w:rFonts w:ascii="Times New Roman" w:hAnsi="Times New Roman" w:cs="Times New Roman"/>
-        </w:rPr>
-        <w:t xml:space="preserve"> up the user manual for our project</w:t>
+        <w:t xml:space="preserve">, and to </w:t>
+      </w:r>
+      <w:r>
+        <w:rPr>
+          <w:rFonts w:ascii="Times New Roman" w:hAnsi="Times New Roman" w:cs="Times New Roman"/>
+        </w:rPr>
+        <w:t>finish up the user manual for our project</w:t>
       </w:r>
       <w:r>
         <w:rPr>
@@ -1725,14 +1711,12 @@
         </w:rPr>
         <w:t xml:space="preserve"> By revisiting these </w:t>
       </w:r>
-      <w:proofErr w:type="gramStart"/>
-      <w:r>
-        <w:rPr>
-          <w:rFonts w:ascii="Times New Roman" w:hAnsi="Times New Roman" w:cs="Times New Roman"/>
-        </w:rPr>
-        <w:t>issues</w:t>
-      </w:r>
-      <w:proofErr w:type="gramEnd"/>
+      <w:r>
+        <w:rPr>
+          <w:rFonts w:ascii="Times New Roman" w:hAnsi="Times New Roman" w:cs="Times New Roman"/>
+        </w:rPr>
+        <w:t>issues,</w:t>
+      </w:r>
       <w:r>
         <w:rPr>
           <w:rFonts w:ascii="Times New Roman" w:hAnsi="Times New Roman" w:cs="Times New Roman"/>
@@ -1822,29 +1806,19 @@
           <w:rFonts w:ascii="Times New Roman" w:hAnsi="Times New Roman" w:cs="Times New Roman"/>
         </w:rPr>
         <w:tab/>
-        <w:t xml:space="preserve">Another very important goal completed this week was to finish our </w:t>
-      </w:r>
-      <w:proofErr w:type="spellStart"/>
-      <w:proofErr w:type="gramStart"/>
-      <w:r>
-        <w:rPr>
-          <w:rFonts w:ascii="Times New Roman" w:hAnsi="Times New Roman" w:cs="Times New Roman"/>
-        </w:rPr>
-        <w:t>users</w:t>
-      </w:r>
-      <w:proofErr w:type="gramEnd"/>
-      <w:r>
-        <w:rPr>
-          <w:rFonts w:ascii="Times New Roman" w:hAnsi="Times New Roman" w:cs="Times New Roman"/>
-        </w:rPr>
-        <w:t xml:space="preserve"> manual</w:t>
-      </w:r>
-      <w:proofErr w:type="spellEnd"/>
-      <w:r>
-        <w:rPr>
-          <w:rFonts w:ascii="Times New Roman" w:hAnsi="Times New Roman" w:cs="Times New Roman"/>
-        </w:rPr>
-        <w:t xml:space="preserve">. This was a rather </w:t>
+        <w:t>Another very important goal completed this week was to finish our user</w:t>
+      </w:r>
+      <w:r>
+        <w:rPr>
+          <w:rFonts w:ascii="Times New Roman" w:hAnsi="Times New Roman" w:cs="Times New Roman"/>
+        </w:rPr>
+        <w:t xml:space="preserve"> </w:t>
+      </w:r>
+      <w:r>
+        <w:rPr>
+          <w:rFonts w:ascii="Times New Roman" w:hAnsi="Times New Roman" w:cs="Times New Roman"/>
+        </w:rPr>
+        <w:t xml:space="preserve">manual. This was a rather </w:t>
       </w:r>
       <w:r>
         <w:rPr>
@@ -1883,14 +1857,12 @@
         </w:rPr>
         <w:t xml:space="preserve">taking a step back and viewing the project from a new </w:t>
       </w:r>
-      <w:proofErr w:type="gramStart"/>
-      <w:r>
-        <w:rPr>
-          <w:rFonts w:ascii="Times New Roman" w:hAnsi="Times New Roman" w:cs="Times New Roman"/>
-        </w:rPr>
-        <w:t>users</w:t>
-      </w:r>
-      <w:proofErr w:type="gramEnd"/>
+      <w:r>
+        <w:rPr>
+          <w:rFonts w:ascii="Times New Roman" w:hAnsi="Times New Roman" w:cs="Times New Roman"/>
+        </w:rPr>
+        <w:t>user’s</w:t>
+      </w:r>
       <w:r>
         <w:rPr>
           <w:rFonts w:ascii="Times New Roman" w:hAnsi="Times New Roman" w:cs="Times New Roman"/>
@@ -2112,14 +2084,12 @@
         </w:rPr>
         <w:t xml:space="preserve"> We also tested our project thoroughly to ensure no bugs slip through the cracks. We have made substantial progress in our final presentation, by finishing up a draft of our slides. The last thing we have completed this week is our user </w:t>
       </w:r>
-      <w:proofErr w:type="gramStart"/>
-      <w:r>
-        <w:rPr>
-          <w:rFonts w:ascii="Times New Roman" w:hAnsi="Times New Roman" w:cs="Times New Roman"/>
-        </w:rPr>
-        <w:t>manual,</w:t>
-      </w:r>
-      <w:proofErr w:type="gramEnd"/>
+      <w:r>
+        <w:rPr>
+          <w:rFonts w:ascii="Times New Roman" w:hAnsi="Times New Roman" w:cs="Times New Roman"/>
+        </w:rPr>
+        <w:t>manual;</w:t>
+      </w:r>
       <w:r>
         <w:rPr>
           <w:rFonts w:ascii="Times New Roman" w:hAnsi="Times New Roman" w:cs="Times New Roman"/>
@@ -2157,14 +2127,11 @@
     </w:p>
     <w:p>
       <w:r>
-        <w:rPr>
-          <w:noProof/>
-        </w:rPr>
         <w:drawing>
-          <wp:inline distT="0" distB="0" distL="0" distR="0" wp14:anchorId="53F51533" wp14:editId="6F2F13CA">
-            <wp:extent cx="5943600" cy="3091180"/>
-            <wp:effectExtent l="19050" t="19050" r="19050" b="13970"/>
-            <wp:docPr id="703845971" name="Picture 1"/>
+          <wp:inline distT="0" distB="0" distL="0" distR="0" wp14:anchorId="5E59224A" wp14:editId="5AC37B4F">
+            <wp:extent cx="5943600" cy="2834005"/>
+            <wp:effectExtent l="19050" t="19050" r="19050" b="23495"/>
+            <wp:docPr id="155236164" name="Picture 1"/>
             <wp:cNvGraphicFramePr>
               <a:graphicFrameLocks xmlns:a="http://schemas.openxmlformats.org/drawingml/2006/main" noChangeAspect="1"/>
             </wp:cNvGraphicFramePr>
@@ -2172,7 +2139,7 @@
               <a:graphicData uri="http://schemas.openxmlformats.org/drawingml/2006/picture">
                 <pic:pic xmlns:pic="http://schemas.openxmlformats.org/drawingml/2006/picture">
                   <pic:nvPicPr>
-                    <pic:cNvPr id="703845971" name=""/>
+                    <pic:cNvPr id="155236164" name=""/>
                     <pic:cNvPicPr/>
                   </pic:nvPicPr>
                   <pic:blipFill>
@@ -2184,7 +2151,7 @@
                   <pic:spPr>
                     <a:xfrm>
                       <a:off x="0" y="0"/>
-                      <a:ext cx="5943600" cy="3091180"/>
+                      <a:ext cx="5943600" cy="2834005"/>
                     </a:xfrm>
                     <a:prstGeom prst="rect">
                       <a:avLst/>

</xml_diff>